<commit_message>
Update attendance automation documentation and tests
</commit_message>
<xml_diff>
--- a/Attendance_Automation_System_Report.docx
+++ b/Attendance_Automation_System_Report.docx
@@ -58,7 +58,7 @@
           <w:b w:val="0"/>
           <w:i w:val="0"/>
         </w:rPr>
-        <w:t>An employee posts their daily report in Slack, and they are clocked in on TimeTrack (time.marsos.io). When they post their completed-work report, they are clocked out. Nobody opens TimeTrack, and nobody learns a new habit — the message the team already writes is what drives it.</w:t>
+        <w:t>An employee posts their daily report in Slack, and they are clocked in on TimeTrack (time.marsos.io). When they post their end-of-day report, they are clocked out. Nobody opens TimeTrack, and nobody learns a new habit — the message the team already writes is what drives it.</w:t>
       </w:r>
     </w:p>
     <w:p>
@@ -166,7 +166,7 @@
                 <w:rFonts w:ascii="Consolas" w:hAnsi="Consolas"/>
                 <w:sz w:val="18"/>
               </w:rPr>
-              <w:t xml:space="preserve">        +--&gt; Start or completed-work report?     no -&gt; ignore</w:t>
+              <w:t xml:space="preserve">        +--&gt; Start or end-of-day report?         no -&gt; ignore</w:t>
             </w:r>
           </w:p>
           <w:p>
@@ -420,14 +420,33 @@
               <w:rPr>
                 <w:sz w:val="19"/>
               </w:rPr>
-              <w:t xml:space="preserve">A report with a line starting </w:t>
+              <w:t xml:space="preserve">A report with an </w:t>
             </w:r>
             <w:r>
               <w:rPr>
                 <w:rFonts w:ascii="Consolas" w:hAnsi="Consolas"/>
                 <w:sz w:val="18"/>
               </w:rPr>
-              <w:t>Completed Work</w:t>
+              <w:t>- End</w:t>
+            </w:r>
+            <w:r>
+              <w:rPr>
+                <w:sz w:val="19"/>
+              </w:rPr>
+              <w:t xml:space="preserve"> header, or a </w:t>
+            </w:r>
+            <w:r>
+              <w:rPr>
+                <w:rFonts w:ascii="Consolas" w:hAnsi="Consolas"/>
+                <w:sz w:val="18"/>
+              </w:rPr>
+              <w:t>Completed Tasks:</w:t>
+            </w:r>
+            <w:r>
+              <w:rPr>
+                <w:sz w:val="19"/>
+              </w:rPr>
+              <w:t xml:space="preserve"> section</w:t>
             </w:r>
           </w:p>
         </w:tc>
@@ -498,7 +517,7 @@
           <w:i w:val="0"/>
           <w:sz w:val="20"/>
         </w:rPr>
-        <w:t>The `Completed Work` marker must start a line, so 'I completed work on the export' written in ordinary chat does not clock anyone out. Slack formatting makes no difference. Bot messages, edits, deletions, thread replies and messages from other channels are all ignored.</w:t>
+        <w:t>For the end report either marker alone is enough. Variants are accepted (Complete, Done, Summary, End of Day, Tasks Completed, and so on). All must start a line, so 'we will review completed tasks tomorrow' in ordinary chat does not clock anyone out. Bot messages, edits, deletions, thread replies and messages from other channels are all ignored.</w:t>
       </w:r>
     </w:p>
     <w:p>
@@ -625,7 +644,7 @@
               <w:rPr>
                 <w:sz w:val="19"/>
               </w:rPr>
-              <w:t>Decides whether a message is a start report, a completed-work report, or ordinary conversation</w:t>
+              <w:t>Decides whether a message is a start report, an end-of-day report, or ordinary conversation</w:t>
             </w:r>
           </w:p>
         </w:tc>
@@ -1365,7 +1384,7 @@
               <w:rPr>
                 <w:sz w:val="19"/>
               </w:rPr>
-              <w:t>Message recognition (start and completed-work reports)</w:t>
+              <w:t>Message recognition (start and end-of-day reports)</w:t>
             </w:r>
           </w:p>
         </w:tc>
@@ -1526,7 +1545,7 @@
               <w:rPr>
                 <w:sz w:val="19"/>
               </w:rPr>
-              <w:t>76 tests, all passing</w:t>
+              <w:t>83 tests, all passing</w:t>
             </w:r>
           </w:p>
         </w:tc>

</xml_diff>